<commit_message>
TIS_hardware_compare_RobastDB integratu=ing with ini and some layout
</commit_message>
<xml_diff>
--- a/info/docs/github/GitHub_manage_branches.docx
+++ b/info/docs/github/GitHub_manage_branches.docx
@@ -46,11 +46,13 @@
         <w:pStyle w:val="NoSpacing"/>
         <w:rPr>
           <w:color w:val="3576F9"/>
-        </w:rPr>
-      </w:pPr>
-      <w:r>
-        <w:rPr>
-          <w:color w:val="3576F9"/>
+          <w:lang w:val="de-DE"/>
+        </w:rPr>
+      </w:pPr>
+      <w:r>
+        <w:rPr>
+          <w:color w:val="3576F9"/>
+          <w:lang w:val="de-DE"/>
         </w:rPr>
         <w:t xml:space="preserve">git branch  </w:t>
       </w:r>
@@ -60,12 +62,54 @@
         <w:pStyle w:val="NoSpacing"/>
         <w:rPr>
           <w:color w:val="3576F9"/>
+          <w:lang w:val="de-DE"/>
         </w:rPr>
       </w:pPr>
       <w:r>
         <w:rPr>
           <w:color w:val="3576F9"/>
           <w:highlight w:val="yellow"/>
+          <w:lang w:val="de-DE"/>
+        </w:rPr>
+        <w:t>git branch -vv</w:t>
+      </w:r>
+    </w:p>
+    <w:p>
+      <w:pPr>
+        <w:pStyle w:val="NoSpacing"/>
+        <w:rPr>
+          <w:color w:val="3576F9"/>
+          <w:lang w:val="de-DE"/>
+        </w:rPr>
+      </w:pPr>
+    </w:p>
+    <w:p>
+      <w:pPr>
+        <w:pStyle w:val="NoSpacing"/>
+        <w:rPr>
+          <w:color w:val="3576F9"/>
+          <w:lang w:val="de-DE"/>
+        </w:rPr>
+      </w:pPr>
+      <w:r>
+        <w:rPr>
+          <w:color w:val="3576F9"/>
+          <w:highlight w:val="green"/>
+          <w:lang w:val="de-DE"/>
+        </w:rPr>
+        <w:t>sum</w:t>
+      </w:r>
+    </w:p>
+    <w:p>
+      <w:pPr>
+        <w:pStyle w:val="NoSpacing"/>
+        <w:rPr>
+          <w:color w:val="3576F9"/>
+        </w:rPr>
+      </w:pPr>
+      <w:r>
+        <w:rPr>
+          <w:color w:val="3576F9"/>
         </w:rPr>
         <w:t>git branch -</w:t>
       </w:r>
@@ -73,52 +117,6 @@
       <w:r>
         <w:rPr>
           <w:color w:val="3576F9"/>
-          <w:highlight w:val="yellow"/>
-        </w:rPr>
-        <w:t>vv</w:t>
-      </w:r>
-      <w:proofErr w:type="spellEnd"/>
-    </w:p>
-    <w:p>
-      <w:pPr>
-        <w:pStyle w:val="NoSpacing"/>
-        <w:rPr>
-          <w:color w:val="3576F9"/>
-        </w:rPr>
-      </w:pPr>
-    </w:p>
-    <w:p>
-      <w:pPr>
-        <w:pStyle w:val="NoSpacing"/>
-        <w:rPr>
-          <w:color w:val="3576F9"/>
-        </w:rPr>
-      </w:pPr>
-      <w:r>
-        <w:rPr>
-          <w:color w:val="3576F9"/>
-          <w:highlight w:val="green"/>
-        </w:rPr>
-        <w:t>sum</w:t>
-      </w:r>
-    </w:p>
-    <w:p>
-      <w:pPr>
-        <w:pStyle w:val="NoSpacing"/>
-        <w:rPr>
-          <w:color w:val="3576F9"/>
-        </w:rPr>
-      </w:pPr>
-      <w:r>
-        <w:rPr>
-          <w:color w:val="3576F9"/>
-        </w:rPr>
-        <w:t>git branch -</w:t>
-      </w:r>
-      <w:proofErr w:type="spellStart"/>
-      <w:r>
-        <w:rPr>
-          <w:color w:val="3576F9"/>
         </w:rPr>
         <w:t>avv</w:t>
       </w:r>
@@ -287,16 +285,8 @@
         <w:rPr>
           <w:color w:val="00B0F0"/>
         </w:rPr>
-        <w:t>git branch -</w:t>
-      </w:r>
-      <w:proofErr w:type="gramStart"/>
-      <w:r>
-        <w:rPr>
-          <w:color w:val="00B0F0"/>
-        </w:rPr>
-        <w:t>r  remote</w:t>
-      </w:r>
-      <w:proofErr w:type="gramEnd"/>
+        <w:t>git branch -r  remote</w:t>
+      </w:r>
     </w:p>
     <w:p>
       <w:pPr>
@@ -491,7 +481,6 @@
         <w:t xml:space="preserve">git config --global </w:t>
       </w:r>
       <w:proofErr w:type="spellStart"/>
-      <w:proofErr w:type="gramStart"/>
       <w:r>
         <w:rPr>
           <w:color w:val="0070C0"/>
@@ -499,7 +488,6 @@
         <w:t>init.defaultBranch</w:t>
       </w:r>
       <w:proofErr w:type="spellEnd"/>
-      <w:proofErr w:type="gramEnd"/>
       <w:r>
         <w:rPr>
           <w:color w:val="0070C0"/>
@@ -518,21 +506,7 @@
         <w:rPr>
           <w:color w:val="0070C0"/>
         </w:rPr>
-        <w:t xml:space="preserve">rename branch If your repo currently says master and you want to rename it </w:t>
-      </w:r>
-      <w:proofErr w:type="gramStart"/>
-      <w:r>
-        <w:rPr>
-          <w:color w:val="0070C0"/>
-        </w:rPr>
-        <w:t>to</w:t>
-      </w:r>
-      <w:proofErr w:type="gramEnd"/>
-      <w:r>
-        <w:rPr>
-          <w:color w:val="0070C0"/>
-        </w:rPr>
-        <w:t xml:space="preserve"> main:</w:t>
+        <w:t>rename branch If your repo currently says master and you want to rename it to main:</w:t>
       </w:r>
     </w:p>
     <w:p>
@@ -732,12 +706,10 @@
         <w:t xml:space="preserve">* </w:t>
       </w:r>
       <w:proofErr w:type="spellStart"/>
-      <w:proofErr w:type="gramStart"/>
       <w:r>
         <w:t>qa</w:t>
       </w:r>
       <w:proofErr w:type="spellEnd"/>
-      <w:proofErr w:type="gramEnd"/>
     </w:p>
     <w:p>
       <w:pPr>
@@ -815,62 +787,224 @@
       <w:pPr>
         <w:pStyle w:val="NoSpacing"/>
       </w:pPr>
-      <w:proofErr w:type="gramStart"/>
       <w:r>
         <w:rPr>
           <w:highlight w:val="green"/>
         </w:rPr>
-        <w:t>dev  →</w:t>
-      </w:r>
-      <w:proofErr w:type="gramEnd"/>
+        <w:t xml:space="preserve">dev  →  </w:t>
+      </w:r>
+      <w:proofErr w:type="spellStart"/>
       <w:r>
         <w:rPr>
           <w:highlight w:val="green"/>
         </w:rPr>
-        <w:t xml:space="preserve">  </w:t>
-      </w:r>
-      <w:proofErr w:type="spellStart"/>
-      <w:proofErr w:type="gramStart"/>
+        <w:t>qa</w:t>
+      </w:r>
+      <w:proofErr w:type="spellEnd"/>
       <w:r>
         <w:rPr>
           <w:highlight w:val="green"/>
         </w:rPr>
+        <w:t xml:space="preserve">  →  main</w:t>
+      </w:r>
+    </w:p>
+    <w:p>
+      <w:pPr>
+        <w:pStyle w:val="NoSpacing"/>
+      </w:pPr>
+    </w:p>
+    <w:p>
+      <w:pPr>
+        <w:pStyle w:val="NoSpacing"/>
+      </w:pPr>
+      <w:r>
+        <w:t># always work in dev</w:t>
+      </w:r>
+    </w:p>
+    <w:p>
+      <w:pPr>
+        <w:pStyle w:val="NoSpacing"/>
+      </w:pPr>
+      <w:r>
+        <w:t>git checkout dev</w:t>
+      </w:r>
+    </w:p>
+    <w:p>
+      <w:pPr>
+        <w:pStyle w:val="NoSpacing"/>
+      </w:pPr>
+    </w:p>
+    <w:p>
+      <w:pPr>
+        <w:pStyle w:val="NoSpacing"/>
+      </w:pPr>
+      <w:r>
+        <w:rPr>
+          <w:highlight w:val="yellow"/>
+        </w:rPr>
+        <w:t># make changes, then commit</w:t>
+      </w:r>
+    </w:p>
+    <w:p>
+      <w:pPr>
+        <w:pStyle w:val="NoSpacing"/>
+      </w:pPr>
+      <w:r>
+        <w:t>git add .</w:t>
+      </w:r>
+    </w:p>
+    <w:p>
+      <w:pPr>
+        <w:pStyle w:val="NoSpacing"/>
+      </w:pPr>
+      <w:r>
+        <w:t>git commit -m "your message"</w:t>
+      </w:r>
+    </w:p>
+    <w:p>
+      <w:pPr>
+        <w:pStyle w:val="NoSpacing"/>
+      </w:pPr>
+      <w:r>
+        <w:t>git push origin dev</w:t>
+      </w:r>
+    </w:p>
+    <w:p>
+      <w:pPr>
+        <w:pStyle w:val="NoSpacing"/>
+      </w:pPr>
+    </w:p>
+    <w:p>
+      <w:pPr>
+        <w:pStyle w:val="NoSpacing"/>
+      </w:pPr>
+      <w:r>
+        <w:rPr>
+          <w:highlight w:val="yellow"/>
+        </w:rPr>
+        <w:t xml:space="preserve">When ready to test — merge dev into </w:t>
+      </w:r>
+      <w:proofErr w:type="spellStart"/>
+      <w:r>
+        <w:rPr>
+          <w:highlight w:val="yellow"/>
+        </w:rPr>
         <w:t>qa</w:t>
       </w:r>
       <w:proofErr w:type="spellEnd"/>
       <w:r>
         <w:rPr>
-          <w:highlight w:val="green"/>
-        </w:rPr>
-        <w:t xml:space="preserve">  →</w:t>
-      </w:r>
-      <w:proofErr w:type="gramEnd"/>
-      <w:r>
-        <w:rPr>
-          <w:highlight w:val="green"/>
-        </w:rPr>
-        <w:t xml:space="preserve">  main</w:t>
-      </w:r>
-    </w:p>
-    <w:p>
-      <w:pPr>
-        <w:pStyle w:val="NoSpacing"/>
-      </w:pPr>
-    </w:p>
-    <w:p>
-      <w:pPr>
-        <w:pStyle w:val="NoSpacing"/>
-      </w:pPr>
-      <w:r>
-        <w:t xml:space="preserve"># </w:t>
-      </w:r>
-      <w:proofErr w:type="gramStart"/>
-      <w:r>
-        <w:t>always</w:t>
-      </w:r>
-      <w:proofErr w:type="gramEnd"/>
-      <w:r>
-        <w:t xml:space="preserve"> work in dev</w:t>
+          <w:highlight w:val="yellow"/>
+        </w:rPr>
+        <w:t>:</w:t>
+      </w:r>
+    </w:p>
+    <w:p>
+      <w:pPr>
+        <w:pStyle w:val="NoSpacing"/>
+      </w:pPr>
+      <w:r>
+        <w:t xml:space="preserve">git checkout </w:t>
+      </w:r>
+      <w:proofErr w:type="spellStart"/>
+      <w:r>
+        <w:t>qa</w:t>
+      </w:r>
+      <w:proofErr w:type="spellEnd"/>
+    </w:p>
+    <w:p>
+      <w:pPr>
+        <w:pStyle w:val="NoSpacing"/>
+      </w:pPr>
+      <w:r>
+        <w:t>git merge dev</w:t>
+      </w:r>
+    </w:p>
+    <w:p>
+      <w:pPr>
+        <w:pStyle w:val="NoSpacing"/>
+      </w:pPr>
+      <w:r>
+        <w:t xml:space="preserve">git push origin </w:t>
+      </w:r>
+      <w:proofErr w:type="spellStart"/>
+      <w:r>
+        <w:t>qa</w:t>
+      </w:r>
+      <w:proofErr w:type="spellEnd"/>
+    </w:p>
+    <w:p>
+      <w:pPr>
+        <w:pStyle w:val="NoSpacing"/>
+      </w:pPr>
+    </w:p>
+    <w:p>
+      <w:pPr>
+        <w:pStyle w:val="NoSpacing"/>
+      </w:pPr>
+      <w:r>
+        <w:t xml:space="preserve">When </w:t>
+      </w:r>
+      <w:proofErr w:type="spellStart"/>
+      <w:r>
+        <w:t>qa</w:t>
+      </w:r>
+      <w:proofErr w:type="spellEnd"/>
+      <w:r>
+        <w:t xml:space="preserve"> is approved — merge </w:t>
+      </w:r>
+      <w:proofErr w:type="spellStart"/>
+      <w:r>
+        <w:t>qa</w:t>
+      </w:r>
+      <w:proofErr w:type="spellEnd"/>
+      <w:r>
+        <w:t xml:space="preserve"> into main:</w:t>
+      </w:r>
+    </w:p>
+    <w:p>
+      <w:pPr>
+        <w:pStyle w:val="NoSpacing"/>
+      </w:pPr>
+      <w:r>
+        <w:t>git checkout main</w:t>
+      </w:r>
+    </w:p>
+    <w:p>
+      <w:pPr>
+        <w:pStyle w:val="NoSpacing"/>
+      </w:pPr>
+      <w:r>
+        <w:t xml:space="preserve">git merge </w:t>
+      </w:r>
+      <w:proofErr w:type="spellStart"/>
+      <w:r>
+        <w:t>qa</w:t>
+      </w:r>
+      <w:proofErr w:type="spellEnd"/>
+    </w:p>
+    <w:p>
+      <w:pPr>
+        <w:pStyle w:val="NoSpacing"/>
+      </w:pPr>
+      <w:r>
+        <w:t>git push origin main</w:t>
+      </w:r>
+    </w:p>
+    <w:p>
+      <w:pPr>
+        <w:pStyle w:val="NoSpacing"/>
+      </w:pPr>
+    </w:p>
+    <w:p>
+      <w:pPr>
+        <w:pStyle w:val="NoSpacing"/>
+      </w:pPr>
+      <w:r>
+        <w:rPr>
+          <w:highlight w:val="yellow"/>
+        </w:rPr>
+        <w:t>Go back to dev to continue working:</w:t>
       </w:r>
     </w:p>
     <w:p>
@@ -891,112 +1025,105 @@
         <w:pStyle w:val="NoSpacing"/>
       </w:pPr>
       <w:r>
-        <w:rPr>
-          <w:highlight w:val="yellow"/>
-        </w:rPr>
-        <w:t xml:space="preserve"># </w:t>
-      </w:r>
-      <w:proofErr w:type="gramStart"/>
-      <w:r>
-        <w:rPr>
-          <w:highlight w:val="yellow"/>
-        </w:rPr>
-        <w:t>make</w:t>
-      </w:r>
-      <w:proofErr w:type="gramEnd"/>
-      <w:r>
-        <w:rPr>
-          <w:highlight w:val="yellow"/>
-        </w:rPr>
-        <w:t xml:space="preserve"> changes, then commit</w:t>
-      </w:r>
-    </w:p>
-    <w:p>
-      <w:pPr>
-        <w:pStyle w:val="NoSpacing"/>
-      </w:pPr>
-      <w:r>
-        <w:t xml:space="preserve">git </w:t>
-      </w:r>
-      <w:proofErr w:type="gramStart"/>
-      <w:r>
-        <w:t>add .</w:t>
-      </w:r>
-      <w:proofErr w:type="gramEnd"/>
-    </w:p>
-    <w:p>
-      <w:pPr>
-        <w:pStyle w:val="NoSpacing"/>
-      </w:pPr>
-      <w:r>
-        <w:t>git commit -m "your message"</w:t>
-      </w:r>
-    </w:p>
-    <w:p>
-      <w:pPr>
-        <w:pStyle w:val="NoSpacing"/>
-      </w:pPr>
-      <w:r>
-        <w:t>git push origin dev</w:t>
-      </w:r>
-    </w:p>
-    <w:p>
-      <w:pPr>
-        <w:pStyle w:val="NoSpacing"/>
-      </w:pPr>
-    </w:p>
-    <w:p>
-      <w:pPr>
-        <w:pStyle w:val="NoSpacing"/>
-      </w:pPr>
-      <w:r>
-        <w:rPr>
-          <w:highlight w:val="yellow"/>
-        </w:rPr>
-        <w:t xml:space="preserve">When ready to test — merge dev into </w:t>
-      </w:r>
-      <w:proofErr w:type="spellStart"/>
-      <w:r>
-        <w:rPr>
-          <w:highlight w:val="yellow"/>
-        </w:rPr>
+        <w:t>git branch</w:t>
+      </w:r>
+    </w:p>
+    <w:p>
+      <w:pPr>
+        <w:pStyle w:val="NoSpacing"/>
+      </w:pPr>
+    </w:p>
+    <w:p>
+      <w:pPr>
+        <w:pStyle w:val="NoSpacing"/>
+      </w:pPr>
+      <w:r>
+        <w:t>Which branch do you want to switch to?</w:t>
+      </w:r>
+    </w:p>
+    <w:p>
+      <w:pPr>
+        <w:pStyle w:val="NoSpacing"/>
+      </w:pPr>
+      <w:r>
+        <w:t>git checkout main</w:t>
+      </w:r>
+    </w:p>
+    <w:p>
+      <w:pPr>
+        <w:pStyle w:val="NoSpacing"/>
+      </w:pPr>
+      <w:r>
+        <w:t xml:space="preserve">git checkout </w:t>
+      </w:r>
+      <w:proofErr w:type="spellStart"/>
+      <w:r>
         <w:t>qa</w:t>
       </w:r>
       <w:proofErr w:type="spellEnd"/>
-      <w:r>
-        <w:rPr>
-          <w:highlight w:val="yellow"/>
-        </w:rPr>
-        <w:t>:</w:t>
-      </w:r>
-    </w:p>
-    <w:p>
-      <w:pPr>
-        <w:pStyle w:val="NoSpacing"/>
-      </w:pPr>
-      <w:r>
+    </w:p>
+    <w:p>
+      <w:pPr>
+        <w:pStyle w:val="NoSpacing"/>
+      </w:pPr>
+      <w:r>
+        <w:t>git checkout dev</w:t>
+      </w:r>
+    </w:p>
+    <w:p>
+      <w:pPr>
+        <w:pStyle w:val="NoSpacing"/>
+      </w:pPr>
+      <w:r>
+        <w:lastRenderedPageBreak/>
         <w:t xml:space="preserve">git checkout </w:t>
       </w:r>
       <w:proofErr w:type="spellStart"/>
       <w:r>
+        <w:t>mainlocalgit</w:t>
+      </w:r>
+      <w:proofErr w:type="spellEnd"/>
+      <w:r>
+        <w:t xml:space="preserve"> checkout </w:t>
+      </w:r>
+      <w:proofErr w:type="spellStart"/>
+      <w:r>
+        <w:t>qalocal</w:t>
+      </w:r>
+      <w:proofErr w:type="spellEnd"/>
+    </w:p>
+    <w:p>
+      <w:pPr>
+        <w:pStyle w:val="NoSpacing"/>
+      </w:pPr>
+      <w:r>
+        <w:t xml:space="preserve">git checkout </w:t>
+      </w:r>
+      <w:proofErr w:type="spellStart"/>
+      <w:r>
+        <w:t>devlocal</w:t>
+      </w:r>
+      <w:proofErr w:type="spellEnd"/>
+    </w:p>
+    <w:p>
+      <w:pPr>
+        <w:pStyle w:val="NoSpacing"/>
+      </w:pPr>
+    </w:p>
+    <w:p>
+      <w:pPr>
+        <w:pStyle w:val="NoSpacing"/>
+      </w:pPr>
+      <w:r>
+        <w:t xml:space="preserve">git checkout -b </w:t>
+      </w:r>
+      <w:proofErr w:type="spellStart"/>
+      <w:r>
         <w:t>qa</w:t>
       </w:r>
       <w:proofErr w:type="spellEnd"/>
-    </w:p>
-    <w:p>
-      <w:pPr>
-        <w:pStyle w:val="NoSpacing"/>
-      </w:pPr>
-      <w:r>
-        <w:t>git merge dev</w:t>
-      </w:r>
-    </w:p>
-    <w:p>
-      <w:pPr>
-        <w:pStyle w:val="NoSpacing"/>
-      </w:pPr>
-      <w:r>
-        <w:t xml:space="preserve">git push origin </w:t>
+      <w:r>
+        <w:t xml:space="preserve"> origin/</w:t>
       </w:r>
       <w:proofErr w:type="spellStart"/>
       <w:r>
@@ -1013,101 +1140,6 @@
       <w:pPr>
         <w:pStyle w:val="NoSpacing"/>
       </w:pPr>
-      <w:r>
-        <w:t xml:space="preserve">When </w:t>
-      </w:r>
-      <w:proofErr w:type="spellStart"/>
-      <w:r>
-        <w:t>qa</w:t>
-      </w:r>
-      <w:proofErr w:type="spellEnd"/>
-      <w:r>
-        <w:t xml:space="preserve"> is approved — merge </w:t>
-      </w:r>
-      <w:proofErr w:type="spellStart"/>
-      <w:r>
-        <w:t>qa</w:t>
-      </w:r>
-      <w:proofErr w:type="spellEnd"/>
-      <w:r>
-        <w:t xml:space="preserve"> into main:</w:t>
-      </w:r>
-    </w:p>
-    <w:p>
-      <w:pPr>
-        <w:pStyle w:val="NoSpacing"/>
-      </w:pPr>
-      <w:r>
-        <w:t>git checkout main</w:t>
-      </w:r>
-    </w:p>
-    <w:p>
-      <w:pPr>
-        <w:pStyle w:val="NoSpacing"/>
-      </w:pPr>
-      <w:r>
-        <w:t xml:space="preserve">git merge </w:t>
-      </w:r>
-      <w:proofErr w:type="spellStart"/>
-      <w:r>
-        <w:t>qa</w:t>
-      </w:r>
-      <w:proofErr w:type="spellEnd"/>
-    </w:p>
-    <w:p>
-      <w:pPr>
-        <w:pStyle w:val="NoSpacing"/>
-      </w:pPr>
-      <w:r>
-        <w:t>git push origin main</w:t>
-      </w:r>
-    </w:p>
-    <w:p>
-      <w:pPr>
-        <w:pStyle w:val="NoSpacing"/>
-      </w:pPr>
-    </w:p>
-    <w:p>
-      <w:pPr>
-        <w:pStyle w:val="NoSpacing"/>
-      </w:pPr>
-      <w:r>
-        <w:rPr>
-          <w:highlight w:val="yellow"/>
-        </w:rPr>
-        <w:t>Go back to dev to continue working:</w:t>
-      </w:r>
-    </w:p>
-    <w:p>
-      <w:pPr>
-        <w:pStyle w:val="NoSpacing"/>
-      </w:pPr>
-      <w:r>
-        <w:t>git checkout dev</w:t>
-      </w:r>
-    </w:p>
-    <w:p>
-      <w:pPr>
-        <w:pStyle w:val="NoSpacing"/>
-      </w:pPr>
-    </w:p>
-    <w:p>
-      <w:pPr>
-        <w:pStyle w:val="NoSpacing"/>
-      </w:pPr>
-      <w:r>
-        <w:t>git branch</w:t>
-      </w:r>
-    </w:p>
-    <w:p>
-      <w:pPr>
-        <w:pStyle w:val="NoSpacing"/>
-      </w:pPr>
-    </w:p>
-    <w:p>
-      <w:pPr>
-        <w:pStyle w:val="NoSpacing"/>
-      </w:pPr>
     </w:p>
     <w:p>
       <w:pPr>
@@ -1118,7 +1150,6 @@
         <w:rPr>
           <w:noProof/>
         </w:rPr>
-        <w:lastRenderedPageBreak/>
         <w:drawing>
           <wp:inline distT="0" distB="0" distL="0" distR="0" wp14:anchorId="1C294F57" wp14:editId="48D2D04D">
             <wp:extent cx="7203057" cy="5417702"/>
@@ -1241,6 +1272,7 @@
           <w:b/>
           <w:bCs/>
         </w:rPr>
+        <w:lastRenderedPageBreak/>
         <w:t>Verify it worked:</w:t>
       </w:r>
     </w:p>
@@ -1317,15 +1349,7 @@
         <w:ind w:hanging="1080"/>
       </w:pPr>
       <w:r>
-        <w:t xml:space="preserve">git </w:t>
-      </w:r>
-      <w:proofErr w:type="gramStart"/>
-      <w:r>
-        <w:t>add .</w:t>
-      </w:r>
-      <w:proofErr w:type="gramEnd"/>
-      <w:r>
-        <w:t xml:space="preserve"> git commit -m "your message here"</w:t>
+        <w:t>git add . git commit -m "your message here"</w:t>
       </w:r>
     </w:p>
     <w:p>

</xml_diff>